<commit_message>
Update docs, README and one-click scripts
</commit_message>
<xml_diff>
--- a/documentation/MarketLink-Project-Report.docx
+++ b/documentation/MarketLink-Project-Report.docx
@@ -46790,6 +46790,7 @@
     <w:p/>
     <w:sectPr>
       <w:headerReference w:type="default" r:id="rId43"/>
+      <w:headerReference w:type="first" r:id="rId99"/>
       <w:footerReference w:type="default" r:id="rId44"/>
       <w:pgSz w:w="11906" w:h="16838"/>
       <w:pgMar w:top="1000" w:right="1003" w:bottom="1000" w:left="1003" w:header="500" w:footer="500" w:gutter="0"/>
@@ -46928,68 +46929,207 @@
         <w:bottom w:val="single" w:sz="4" w:space="4" w:color="D9D4CB"/>
       </w:pBdr>
       <w:tabs>
+        <w:tab w:val="center" w:pos="4950"/>
         <w:tab w:val="right" w:pos="9900"/>
       </w:tabs>
+      <w:spacing w:after="0"/>
     </w:pPr>
-    <w:proofErr w:type="spellStart"/>
+    <w:r>
+      <w:drawing>
+        <wp:inline distT="0" distB="0" distL="0" distR="0">
+          <wp:extent cx="563291" cy="246888"/>
+          <wp:docPr id="9001" name="Aptech Learning logo" descr="Aptech Learning logo"/>
+          <wp:cNvGraphicFramePr>
+            <a:graphicFrameLocks xmlns:a="http://schemas.openxmlformats.org/drawingml/2006/main" noChangeAspect="1"/>
+          </wp:cNvGraphicFramePr>
+          <a:graphic xmlns:a="http://schemas.openxmlformats.org/drawingml/2006/main">
+            <a:graphicData uri="http://schemas.openxmlformats.org/drawingml/2006/picture">
+              <pic:pic xmlns:pic="http://schemas.openxmlformats.org/drawingml/2006/picture">
+                <pic:nvPicPr>
+                  <pic:cNvPr id="9001" name="Aptech Learning logo"/>
+                  <pic:cNvPicPr/>
+                </pic:nvPicPr>
+                <pic:blipFill>
+                  <a:blip r:embed="rIdLogoA"/>
+                  <a:stretch>
+                    <a:fillRect/>
+                  </a:stretch>
+                </pic:blipFill>
+                <pic:spPr>
+                  <a:xfrm>
+                    <a:off x="0" y="0"/>
+                    <a:ext cx="563291" cy="246888"/>
+                  </a:xfrm>
+                  <a:prstGeom prst="rect">
+                    <a:avLst/>
+                  </a:prstGeom>
+                </pic:spPr>
+              </pic:pic>
+            </a:graphicData>
+          </a:graphic>
+        </wp:inline>
+      </w:drawing>
+    </w:r>
+    <w:r>
+      <w:tab/>
+    </w:r>
     <w:r>
       <w:rPr>
         <w:b/>
         <w:bCs/>
         <w:color w:val="1F3D2B"/>
+        <w:position w:val="8"/>
         <w:sz w:val="15"/>
         <w:szCs w:val="15"/>
       </w:rPr>
-      <w:t>MarketLink</w:t>
-    </w:r>
-    <w:proofErr w:type="spellEnd"/>
-    <w:r>
-      <w:rPr>
-        <w:color w:val="8C857B"/>
-        <w:spacing w:val="20"/>
-        <w:sz w:val="14"/>
-        <w:szCs w:val="14"/>
-      </w:rPr>
-      <w:tab/>
-      <w:t xml:space="preserve">PROJECT </w:t>
-    </w:r>
-    <w:proofErr w:type="gramStart"/>
-    <w:r>
-      <w:rPr>
-        <w:color w:val="8C857B"/>
-        <w:spacing w:val="20"/>
-        <w:sz w:val="14"/>
-        <w:szCs w:val="14"/>
-      </w:rPr>
-      <w:t>REPORT  ·</w:t>
-    </w:r>
-    <w:proofErr w:type="gramEnd"/>
-    <w:r>
-      <w:rPr>
-        <w:color w:val="8C857B"/>
-        <w:spacing w:val="20"/>
-        <w:sz w:val="14"/>
-        <w:szCs w:val="14"/>
-      </w:rPr>
-      <w:t xml:space="preserve">  TECHWIZ</w:t>
+      <w:t xml:space="preserve">MarketLink</w:t>
     </w:r>
     <w:r>
       <w:rPr>
         <w:color w:val="8C857B"/>
-        <w:spacing w:val="20"/>
-        <w:sz w:val="14"/>
-        <w:szCs w:val="14"/>
+        <w:spacing w:val="30"/>
+        <w:position w:val="8"/>
+        <w:sz w:val="13"/>
+        <w:szCs w:val="13"/>
       </w:rPr>
-      <w:t>Z</w:t>
+      <w:t xml:space="preserve">  ·  PROJECT REPORT</w:t>
+    </w:r>
+    <w:r>
+      <w:tab/>
     </w:r>
     <w:r>
       <w:rPr>
-        <w:color w:val="8C857B"/>
-        <w:spacing w:val="20"/>
-        <w:sz w:val="14"/>
-        <w:szCs w:val="14"/>
+        <w:position w:val="6"/>
       </w:rPr>
-      <w:t xml:space="preserve"> 7</w:t>
+      <w:drawing>
+        <wp:inline distT="0" distB="0" distL="0" distR="0">
+          <wp:extent cx="1463040" cy="163309"/>
+          <wp:docPr id="9002" name="TechWiz 7 logo" descr="TechWiz 7 logo"/>
+          <wp:cNvGraphicFramePr>
+            <a:graphicFrameLocks xmlns:a="http://schemas.openxmlformats.org/drawingml/2006/main" noChangeAspect="1"/>
+          </wp:cNvGraphicFramePr>
+          <a:graphic xmlns:a="http://schemas.openxmlformats.org/drawingml/2006/main">
+            <a:graphicData uri="http://schemas.openxmlformats.org/drawingml/2006/picture">
+              <pic:pic xmlns:pic="http://schemas.openxmlformats.org/drawingml/2006/picture">
+                <pic:nvPicPr>
+                  <pic:cNvPr id="9002" name="TechWiz 7 logo"/>
+                  <pic:cNvPicPr/>
+                </pic:nvPicPr>
+                <pic:blipFill>
+                  <a:blip r:embed="rIdLogoT"/>
+                  <a:stretch>
+                    <a:fillRect/>
+                  </a:stretch>
+                </pic:blipFill>
+                <pic:spPr>
+                  <a:xfrm>
+                    <a:off x="0" y="0"/>
+                    <a:ext cx="1463040" cy="163309"/>
+                  </a:xfrm>
+                  <a:prstGeom prst="rect">
+                    <a:avLst/>
+                  </a:prstGeom>
+                </pic:spPr>
+              </pic:pic>
+            </a:graphicData>
+          </a:graphic>
+        </wp:inline>
+      </w:drawing>
+    </w:r>
+  </w:p>
+</w:hdr>
+</file>
+
+<file path=word/header2.xml><?xml version="1.0" encoding="utf-8"?>
+<w:hdr xmlns:wpc="http://schemas.microsoft.com/office/word/2010/wordprocessingCanvas" xmlns:cx="http://schemas.microsoft.com/office/drawing/2014/chartex" xmlns:cx1="http://schemas.microsoft.com/office/drawing/2015/9/8/chartex" xmlns:cx2="http://schemas.microsoft.com/office/drawing/2015/10/21/chartex" xmlns:cx3="http://schemas.microsoft.com/office/drawing/2016/5/9/chartex" xmlns:cx4="http://schemas.microsoft.com/office/drawing/2016/5/10/chartex" xmlns:cx5="http://schemas.microsoft.com/office/drawing/2016/5/11/chartex" xmlns:cx6="http://schemas.microsoft.com/office/drawing/2016/5/12/chartex" xmlns:cx7="http://schemas.microsoft.com/office/drawing/2016/5/13/chartex" xmlns:cx8="http://schemas.microsoft.com/office/drawing/2016/5/14/chartex" xmlns:mc="http://schemas.openxmlformats.org/markup-compatibility/2006" xmlns:aink="http://schemas.microsoft.com/office/drawing/2016/ink" xmlns:am3d="http://schemas.microsoft.com/office/drawing/2017/model3d" xmlns:o="urn:schemas-microsoft-com:office:office" xmlns:oel="http://schemas.microsoft.com/office/2019/extlst" xmlns:r="http://schemas.openxmlformats.org/officeDocument/2006/relationships" xmlns:m="http://schemas.openxmlformats.org/officeDocument/2006/math" xmlns:v="urn:schemas-microsoft-com:vml" xmlns:wp14="http://schemas.microsoft.com/office/word/2010/wordprocessingDrawing" xmlns:wp="http://schemas.openxmlformats.org/drawingml/2006/wordprocessingDrawing" xmlns:w10="urn:schemas-microsoft-com:office:word" xmlns:w="http://schemas.openxmlformats.org/wordprocessingml/2006/main" xmlns:w14="http://schemas.microsoft.com/office/word/2010/wordml" xmlns:w15="http://schemas.microsoft.com/office/word/2012/wordml" xmlns:w16cex="http://schemas.microsoft.com/office/word/2018/wordml/cex" xmlns:w16cid="http://schemas.microsoft.com/office/word/2016/wordml/cid" xmlns:w16="http://schemas.microsoft.com/office/word/2018/wordml" xmlns:w16du="http://schemas.microsoft.com/office/word/2023/wordml/word16du" xmlns:w16sdtdh="http://schemas.microsoft.com/office/word/2020/wordml/sdtdatahash" xmlns:w16sdtfl="http://schemas.microsoft.com/office/word/2024/wordml/sdtformatlock" xmlns:w16se="http://schemas.microsoft.com/office/word/2015/wordml/symex" xmlns:wpg="http://schemas.microsoft.com/office/word/2010/wordprocessingGroup" xmlns:wpi="http://schemas.microsoft.com/office/word/2010/wordprocessingInk" xmlns:wne="http://schemas.microsoft.com/office/word/2006/wordml" xmlns:wps="http://schemas.microsoft.com/office/word/2010/wordprocessingShape" mc:Ignorable="w14 w15 w16se w16cid w16 w16cex w16sdtdh w16sdtfl w16du wp14">
+  <w:p>
+    <w:pPr>
+      <w:tabs>
+        <w:tab w:val="center" w:pos="4950"/>
+        <w:tab w:val="right" w:pos="9900"/>
+      </w:tabs>
+      <w:spacing w:after="240"/>
+    </w:pPr>
+    <w:r>
+      <w:drawing>
+        <wp:inline distT="0" distB="0" distL="0" distR="0">
+          <wp:extent cx="1147445" cy="502920"/>
+          <wp:docPr id="9001" name="Aptech Learning logo" descr="Aptech Learning logo"/>
+          <wp:cNvGraphicFramePr>
+            <a:graphicFrameLocks xmlns:a="http://schemas.openxmlformats.org/drawingml/2006/main" noChangeAspect="1"/>
+          </wp:cNvGraphicFramePr>
+          <a:graphic xmlns:a="http://schemas.openxmlformats.org/drawingml/2006/main">
+            <a:graphicData uri="http://schemas.openxmlformats.org/drawingml/2006/picture">
+              <pic:pic xmlns:pic="http://schemas.openxmlformats.org/drawingml/2006/picture">
+                <pic:nvPicPr>
+                  <pic:cNvPr id="9001" name="Aptech Learning logo"/>
+                  <pic:cNvPicPr/>
+                </pic:nvPicPr>
+                <pic:blipFill>
+                  <a:blip r:embed="rIdLogoA"/>
+                  <a:stretch>
+                    <a:fillRect/>
+                  </a:stretch>
+                </pic:blipFill>
+                <pic:spPr>
+                  <a:xfrm>
+                    <a:off x="0" y="0"/>
+                    <a:ext cx="1147445" cy="502920"/>
+                  </a:xfrm>
+                  <a:prstGeom prst="rect">
+                    <a:avLst/>
+                  </a:prstGeom>
+                </pic:spPr>
+              </pic:pic>
+            </a:graphicData>
+          </a:graphic>
+        </wp:inline>
+      </w:drawing>
+    </w:r>
+    <w:r>
+      <w:tab/>
+    </w:r>
+    <w:r>
+      <w:tab/>
+    </w:r>
+    <w:r>
+      <w:rPr>
+        <w:position w:val="15"/>
+      </w:rPr>
+      <w:drawing>
+        <wp:inline distT="0" distB="0" distL="0" distR="0">
+          <wp:extent cx="2468880" cy="275585"/>
+          <wp:docPr id="9002" name="TechWiz 7 logo" descr="TechWiz 7 logo"/>
+          <wp:cNvGraphicFramePr>
+            <a:graphicFrameLocks xmlns:a="http://schemas.openxmlformats.org/drawingml/2006/main" noChangeAspect="1"/>
+          </wp:cNvGraphicFramePr>
+          <a:graphic xmlns:a="http://schemas.openxmlformats.org/drawingml/2006/main">
+            <a:graphicData uri="http://schemas.openxmlformats.org/drawingml/2006/picture">
+              <pic:pic xmlns:pic="http://schemas.openxmlformats.org/drawingml/2006/picture">
+                <pic:nvPicPr>
+                  <pic:cNvPr id="9002" name="TechWiz 7 logo"/>
+                  <pic:cNvPicPr/>
+                </pic:nvPicPr>
+                <pic:blipFill>
+                  <a:blip r:embed="rIdLogoT"/>
+                  <a:stretch>
+                    <a:fillRect/>
+                  </a:stretch>
+                </pic:blipFill>
+                <pic:spPr>
+                  <a:xfrm>
+                    <a:off x="0" y="0"/>
+                    <a:ext cx="2468880" cy="275585"/>
+                  </a:xfrm>
+                  <a:prstGeom prst="rect">
+                    <a:avLst/>
+                  </a:prstGeom>
+                </pic:spPr>
+              </pic:pic>
+            </a:graphicData>
+          </a:graphic>
+        </wp:inline>
+      </w:drawing>
     </w:r>
   </w:p>
 </w:hdr>

</xml_diff>